<commit_message>
more methods and osrm first code
</commit_message>
<xml_diff>
--- a/docs_mar_san/GLIMS_Roadmap.docx
+++ b/docs_mar_san/GLIMS_Roadmap.docx
@@ -281,6 +281,7 @@
           <w:color w:val="2E5496"/>
           <w:sz w:val="24"/>
           <w:szCs w:val="24"/>
+          <w:lang w:val="en-GB"/>
         </w:rPr>
       </w:pPr>
     </w:p>
@@ -364,12 +365,6 @@
         <w:gridCol w:w="3400"/>
       </w:tblGrid>
       <w:tr>
-        <w:tblPrEx>
-          <w:tblCellMar>
-            <w:top w:w="0" w:type="dxa"/>
-            <w:bottom w:w="0" w:type="dxa"/>
-          </w:tblCellMar>
-        </w:tblPrEx>
         <w:trPr>
           <w:tblHeader/>
         </w:trPr>
@@ -447,12 +442,6 @@
         </w:tc>
       </w:tr>
       <w:tr>
-        <w:tblPrEx>
-          <w:tblCellMar>
-            <w:top w:w="0" w:type="dxa"/>
-            <w:bottom w:w="0" w:type="dxa"/>
-          </w:tblCellMar>
-        </w:tblPrEx>
         <w:tc>
           <w:tcPr>
             <w:tcW w:w="1400" w:type="dxa"/>
@@ -579,12 +568,6 @@
         </w:tc>
       </w:tr>
       <w:tr>
-        <w:tblPrEx>
-          <w:tblCellMar>
-            <w:top w:w="0" w:type="dxa"/>
-            <w:bottom w:w="0" w:type="dxa"/>
-          </w:tblCellMar>
-        </w:tblPrEx>
         <w:tc>
           <w:tcPr>
             <w:tcW w:w="1400" w:type="dxa"/>
@@ -733,12 +716,6 @@
         </w:tc>
       </w:tr>
       <w:tr>
-        <w:tblPrEx>
-          <w:tblCellMar>
-            <w:top w:w="0" w:type="dxa"/>
-            <w:bottom w:w="0" w:type="dxa"/>
-          </w:tblCellMar>
-        </w:tblPrEx>
         <w:tc>
           <w:tcPr>
             <w:tcW w:w="1400" w:type="dxa"/>
@@ -934,15 +911,7 @@
           <w:szCs w:val="22"/>
           <w:lang w:val="en-GB"/>
         </w:rPr>
-        <w:t xml:space="preserve"> bugs that currently distort the results are fixed, all parameters are centralized into one source of truth, and the code is made portable and reproducible. The goal isn't to add anything new, but to have one reliable simulator that can be trusted before building anything on top of it</w:t>
-      </w:r>
-      <w:r>
-        <w:rPr>
-          <w:sz w:val="22"/>
-          <w:szCs w:val="22"/>
-          <w:lang w:val="en-GB"/>
-        </w:rPr>
-        <w:t xml:space="preserve">. </w:t>
+        <w:t xml:space="preserve"> bugs that currently distort the results are fixed, all parameters are centralized into one source of truth, and the code is made portable and reproducible. The goal isn't to add anything new, but to have one reliable simulator that can be trusted before building anything on top of it. </w:t>
       </w:r>
     </w:p>
     <w:p>
@@ -1403,6 +1372,13 @@
           <w:lang w:val="en-GB"/>
         </w:rPr>
         <w:t>. Replaces scattered logic across all three files.</w:t>
+      </w:r>
+      <w:r>
+        <w:rPr>
+          <w:color w:val="222222"/>
+          <w:lang w:val="en-GB"/>
+        </w:rPr>
+        <w:t xml:space="preserve"> </w:t>
       </w:r>
     </w:p>
     <w:p>
@@ -6426,6 +6402,7 @@
   <w:style w:type="character" w:default="1" w:styleId="DefaultParagraphFont">
     <w:name w:val="Default Paragraph Font"/>
     <w:uiPriority w:val="1"/>
+    <w:semiHidden/>
     <w:unhideWhenUsed/>
   </w:style>
   <w:style w:type="table" w:default="1" w:styleId="TableNormal">

</xml_diff>